<commit_message>
hope this doesn't break anything
</commit_message>
<xml_diff>
--- a/docpac_17121225/UpdatedBoilerplate.docx
+++ b/docpac_17121225/UpdatedBoilerplate.docx
@@ -1,6 +1,6 @@
 
 <file path=word/document.xml><?xml version="1.0" encoding="utf-8"?>
-<w:document xmlns:wpc="http://schemas.microsoft.com/office/word/2010/wordprocessingCanvas" xmlns:cx="http://schemas.microsoft.com/office/drawing/2014/chartex" xmlns:cx1="http://schemas.microsoft.com/office/drawing/2015/9/8/chartex" xmlns:cx2="http://schemas.microsoft.com/office/drawing/2015/10/21/chartex" xmlns:cx3="http://schemas.microsoft.com/office/drawing/2016/5/9/chartex" xmlns:cx4="http://schemas.microsoft.com/office/drawing/2016/5/10/chartex" xmlns:cx5="http://schemas.microsoft.com/office/drawing/2016/5/11/chartex" xmlns:cx6="http://schemas.microsoft.com/office/drawing/2016/5/12/chartex" xmlns:cx7="http://schemas.microsoft.com/office/drawing/2016/5/13/chartex" xmlns:cx8="http://schemas.microsoft.com/office/drawing/2016/5/14/chartex" xmlns:mc="http://schemas.openxmlformats.org/markup-compatibility/2006" xmlns:aink="http://schemas.microsoft.com/office/drawing/2016/ink" xmlns:am3d="http://schemas.microsoft.com/office/drawing/2017/model3d" xmlns:o="urn:schemas-microsoft-com:office:office" xmlns:r="http://schemas.openxmlformats.org/officeDocument/2006/relationships" xmlns:m="http://schemas.openxmlformats.org/officeDocument/2006/math" xmlns:v="urn:schemas-microsoft-com:vml" xmlns:wp14="http://schemas.microsoft.com/office/word/2010/wordprocessingDrawing" xmlns:wp="http://schemas.openxmlformats.org/drawingml/2006/wordprocessingDrawing" xmlns:w10="urn:schemas-microsoft-com:office:word" xmlns:w="http://schemas.openxmlformats.org/wordprocessingml/2006/main" xmlns:w14="http://schemas.microsoft.com/office/word/2010/wordml" xmlns:w15="http://schemas.microsoft.com/office/word/2012/wordml" xmlns:w16cid="http://schemas.microsoft.com/office/word/2016/wordml/cid" xmlns:w16se="http://schemas.microsoft.com/office/word/2015/wordml/symex" xmlns:wpg="http://schemas.microsoft.com/office/word/2010/wordprocessingGroup" xmlns:wpi="http://schemas.microsoft.com/office/word/2010/wordprocessingInk" xmlns:wne="http://schemas.microsoft.com/office/word/2006/wordml" xmlns:wps="http://schemas.microsoft.com/office/word/2010/wordprocessingShape" mc:Ignorable="w14 w15 w16se w16cid wp14">
+<w:document xmlns:wpc="http://schemas.microsoft.com/office/word/2010/wordprocessingCanvas" xmlns:cx="http://schemas.microsoft.com/office/drawing/2014/chartex" xmlns:cx1="http://schemas.microsoft.com/office/drawing/2015/9/8/chartex" xmlns:cx2="http://schemas.microsoft.com/office/drawing/2015/10/21/chartex" xmlns:cx3="http://schemas.microsoft.com/office/drawing/2016/5/9/chartex" xmlns:cx4="http://schemas.microsoft.com/office/drawing/2016/5/10/chartex" xmlns:cx5="http://schemas.microsoft.com/office/drawing/2016/5/11/chartex" xmlns:cx6="http://schemas.microsoft.com/office/drawing/2016/5/12/chartex" xmlns:cx7="http://schemas.microsoft.com/office/drawing/2016/5/13/chartex" xmlns:cx8="http://schemas.microsoft.com/office/drawing/2016/5/14/chartex" xmlns:mc="http://schemas.openxmlformats.org/markup-compatibility/2006" xmlns:aink="http://schemas.microsoft.com/office/drawing/2016/ink" xmlns:am3d="http://schemas.microsoft.com/office/drawing/2017/model3d" xmlns:o="urn:schemas-microsoft-com:office:office" xmlns:oel="http://schemas.microsoft.com/office/2019/extlst" xmlns:r="http://schemas.openxmlformats.org/officeDocument/2006/relationships" xmlns:m="http://schemas.openxmlformats.org/officeDocument/2006/math" xmlns:v="urn:schemas-microsoft-com:vml" xmlns:wp14="http://schemas.microsoft.com/office/word/2010/wordprocessingDrawing" xmlns:wp="http://schemas.openxmlformats.org/drawingml/2006/wordprocessingDrawing" xmlns:w10="urn:schemas-microsoft-com:office:word" xmlns:w="http://schemas.openxmlformats.org/wordprocessingml/2006/main" xmlns:w14="http://schemas.microsoft.com/office/word/2010/wordml" xmlns:w15="http://schemas.microsoft.com/office/word/2012/wordml" xmlns:w16cex="http://schemas.microsoft.com/office/word/2018/wordml/cex" xmlns:w16cid="http://schemas.microsoft.com/office/word/2016/wordml/cid" xmlns:w16="http://schemas.microsoft.com/office/word/2018/wordml" xmlns:w16du="http://schemas.microsoft.com/office/word/2023/wordml/word16du" xmlns:w16sdtdh="http://schemas.microsoft.com/office/word/2020/wordml/sdtdatahash" xmlns:w16sdtfl="http://schemas.microsoft.com/office/word/2024/wordml/sdtformatlock" xmlns:w16se="http://schemas.microsoft.com/office/word/2015/wordml/symex" xmlns:wpg="http://schemas.microsoft.com/office/word/2010/wordprocessingGroup" xmlns:wpi="http://schemas.microsoft.com/office/word/2010/wordprocessingInk" xmlns:wne="http://schemas.microsoft.com/office/word/2006/wordml" xmlns:wps="http://schemas.microsoft.com/office/word/2010/wordprocessingShape" mc:Ignorable="w14 w15 w16se w16cid w16 w16cex w16sdtdh w16sdtfl w16du wp14">
   <w:body>
     <w:p>
       <w:pPr>
@@ -159,8 +159,6 @@
         <w:br/>
         <w:t>• Socket.IO with per-room instance handling</w:t>
       </w:r>
-      <w:bookmarkStart w:id="0" w:name="_GoBack"/>
-      <w:bookmarkEnd w:id="0"/>
       <w:r>
         <w:rPr>
           <w:rFonts w:eastAsia="Times New Roman" w:cs="Times New Roman"/>
@@ -2373,6 +2371,7 @@
         <w:br/>
         <w:t xml:space="preserve">• Must ignore at least: </w:t>
       </w:r>
+      <w:proofErr w:type="spellStart"/>
       <w:r>
         <w:rPr>
           <w:rFonts w:ascii="Consolas" w:eastAsia="Times New Roman" w:hAnsi="Consolas" w:cs="Courier New"/>
@@ -2380,6 +2379,7 @@
         </w:rPr>
         <w:t>node_modules</w:t>
       </w:r>
+      <w:proofErr w:type="spellEnd"/>
       <w:r>
         <w:rPr>
           <w:rFonts w:eastAsia="Times New Roman" w:cs="Times New Roman"/>
@@ -2417,6 +2417,7 @@
         <w:t>sqlite</w:t>
       </w:r>
       <w:proofErr w:type="spellEnd"/>
+      <w:proofErr w:type="gramStart"/>
       <w:r>
         <w:rPr>
           <w:rFonts w:eastAsia="Times New Roman" w:cs="Times New Roman"/>
@@ -2431,6 +2432,7 @@
         </w:rPr>
         <w:t>.env</w:t>
       </w:r>
+      <w:proofErr w:type="gramEnd"/>
       <w:r>
         <w:rPr>
           <w:rFonts w:eastAsia="Times New Roman" w:cs="Times New Roman"/>
@@ -2564,7 +2566,15 @@
           <w:szCs w:val="24"/>
         </w:rPr>
         <w:br/>
-        <w:t xml:space="preserve">• Same keys as </w:t>
+        <w:t xml:space="preserve">• Same keys </w:t>
+      </w:r>
+      <w:proofErr w:type="gramStart"/>
+      <w:r>
+        <w:rPr>
+          <w:rFonts w:eastAsia="Times New Roman" w:cs="Times New Roman"/>
+          <w:szCs w:val="24"/>
+        </w:rPr>
+        <w:t xml:space="preserve">as </w:t>
       </w:r>
       <w:r>
         <w:rPr>
@@ -2573,6 +2583,7 @@
         </w:rPr>
         <w:t>.env</w:t>
       </w:r>
+      <w:proofErr w:type="gramEnd"/>
       <w:r>
         <w:rPr>
           <w:rFonts w:eastAsia="Times New Roman" w:cs="Times New Roman"/>
@@ -2586,7 +2597,23 @@
           <w:szCs w:val="24"/>
         </w:rPr>
         <w:br/>
-        <w:t>• This is what you will commit to Git so that someone else can clone the repo and know which environment variables they must provide.</w:t>
+        <w:t xml:space="preserve">• This is what you will commit to Git so that someone else can clone the repo and know which </w:t>
+      </w:r>
+      <w:proofErr w:type="gramStart"/>
+      <w:r>
+        <w:rPr>
+          <w:rFonts w:eastAsia="Times New Roman" w:cs="Times New Roman"/>
+          <w:szCs w:val="24"/>
+        </w:rPr>
+        <w:t>environment</w:t>
+      </w:r>
+      <w:proofErr w:type="gramEnd"/>
+      <w:r>
+        <w:rPr>
+          <w:rFonts w:eastAsia="Times New Roman" w:cs="Times New Roman"/>
+          <w:szCs w:val="24"/>
+        </w:rPr>
+        <w:t xml:space="preserve"> variables they must provide.</w:t>
       </w:r>
     </w:p>
     <w:p>
@@ -3033,8 +3060,8 @@
           <w:rFonts w:eastAsia="Times New Roman" w:cs="Times New Roman"/>
           <w:szCs w:val="24"/>
         </w:rPr>
-        <w:pict>
-          <v:rect id="_x0000_i1026" style="width:0;height:1.5pt" o:hralign="center" o:hrstd="t" o:hr="t" fillcolor="#a0a0a0" stroked="f"/>
+        <w:pict w14:anchorId="08136974">
+          <v:rect id="_x0000_i1025" style="width:0;height:1.5pt" o:hralign="center" o:hrstd="t" o:hr="t" fillcolor="#a0a0a0" stroked="f"/>
         </w:pict>
       </w:r>
     </w:p>
@@ -3116,13 +3143,344 @@
         <w:t xml:space="preserve">• Initialize </w:t>
       </w:r>
       <w:proofErr w:type="spellStart"/>
+      <w:r>
+        <w:rPr>
+          <w:rFonts w:ascii="Consolas" w:eastAsia="Times New Roman" w:hAnsi="Consolas" w:cs="Courier New"/>
+          <w:szCs w:val="20"/>
+        </w:rPr>
+        <w:t>package.json</w:t>
+      </w:r>
+      <w:proofErr w:type="spellEnd"/>
+      <w:r>
+        <w:rPr>
+          <w:rFonts w:eastAsia="Times New Roman" w:cs="Times New Roman"/>
+          <w:szCs w:val="24"/>
+        </w:rPr>
+        <w:t xml:space="preserve"> using </w:t>
+      </w:r>
+      <w:proofErr w:type="spellStart"/>
+      <w:r>
+        <w:rPr>
+          <w:rFonts w:ascii="Consolas" w:eastAsia="Times New Roman" w:hAnsi="Consolas" w:cs="Courier New"/>
+          <w:szCs w:val="20"/>
+        </w:rPr>
+        <w:t>npm</w:t>
+      </w:r>
+      <w:proofErr w:type="spellEnd"/>
+      <w:r>
+        <w:rPr>
+          <w:rFonts w:ascii="Consolas" w:eastAsia="Times New Roman" w:hAnsi="Consolas" w:cs="Courier New"/>
+          <w:szCs w:val="20"/>
+        </w:rPr>
+        <w:t xml:space="preserve"> </w:t>
+      </w:r>
+      <w:proofErr w:type="spellStart"/>
+      <w:r>
+        <w:rPr>
+          <w:rFonts w:ascii="Consolas" w:eastAsia="Times New Roman" w:hAnsi="Consolas" w:cs="Courier New"/>
+          <w:szCs w:val="20"/>
+        </w:rPr>
+        <w:t>init</w:t>
+      </w:r>
+      <w:proofErr w:type="spellEnd"/>
+      <w:r>
+        <w:rPr>
+          <w:rFonts w:eastAsia="Times New Roman" w:cs="Times New Roman"/>
+          <w:szCs w:val="24"/>
+        </w:rPr>
+        <w:t xml:space="preserve"> or </w:t>
+      </w:r>
+      <w:proofErr w:type="spellStart"/>
+      <w:r>
+        <w:rPr>
+          <w:rFonts w:ascii="Consolas" w:eastAsia="Times New Roman" w:hAnsi="Consolas" w:cs="Courier New"/>
+          <w:szCs w:val="20"/>
+        </w:rPr>
+        <w:t>npm</w:t>
+      </w:r>
+      <w:proofErr w:type="spellEnd"/>
+      <w:r>
+        <w:rPr>
+          <w:rFonts w:ascii="Consolas" w:eastAsia="Times New Roman" w:hAnsi="Consolas" w:cs="Courier New"/>
+          <w:szCs w:val="20"/>
+        </w:rPr>
+        <w:t xml:space="preserve"> </w:t>
+      </w:r>
+      <w:proofErr w:type="spellStart"/>
+      <w:r>
+        <w:rPr>
+          <w:rFonts w:ascii="Consolas" w:eastAsia="Times New Roman" w:hAnsi="Consolas" w:cs="Courier New"/>
+          <w:szCs w:val="20"/>
+        </w:rPr>
+        <w:t>init</w:t>
+      </w:r>
+      <w:proofErr w:type="spellEnd"/>
+      <w:r>
+        <w:rPr>
+          <w:rFonts w:ascii="Consolas" w:eastAsia="Times New Roman" w:hAnsi="Consolas" w:cs="Courier New"/>
+          <w:szCs w:val="20"/>
+        </w:rPr>
+        <w:t xml:space="preserve"> -y</w:t>
+      </w:r>
+      <w:r>
+        <w:rPr>
+          <w:rFonts w:eastAsia="Times New Roman" w:cs="Times New Roman"/>
+          <w:szCs w:val="24"/>
+        </w:rPr>
+        <w:t>.</w:t>
+      </w:r>
+      <w:r>
+        <w:rPr>
+          <w:rFonts w:eastAsia="Times New Roman" w:cs="Times New Roman"/>
+          <w:szCs w:val="24"/>
+        </w:rPr>
+        <w:br/>
+        <w:t>• Install core dependencies, at minimum:</w:t>
+      </w:r>
+      <w:r>
+        <w:rPr>
+          <w:rFonts w:eastAsia="Times New Roman" w:cs="Times New Roman"/>
+          <w:szCs w:val="24"/>
+        </w:rPr>
+        <w:br/>
+        <w:t xml:space="preserve">• </w:t>
+      </w:r>
+      <w:r>
+        <w:rPr>
+          <w:rFonts w:ascii="Consolas" w:eastAsia="Times New Roman" w:hAnsi="Consolas" w:cs="Courier New"/>
+          <w:szCs w:val="20"/>
+        </w:rPr>
+        <w:t>express</w:t>
+      </w:r>
+      <w:r>
+        <w:rPr>
+          <w:rFonts w:eastAsia="Times New Roman" w:cs="Times New Roman"/>
+          <w:szCs w:val="24"/>
+        </w:rPr>
+        <w:br/>
+        <w:t xml:space="preserve">• </w:t>
+      </w:r>
+      <w:proofErr w:type="spellStart"/>
+      <w:r>
+        <w:rPr>
+          <w:rFonts w:ascii="Consolas" w:eastAsia="Times New Roman" w:hAnsi="Consolas" w:cs="Courier New"/>
+          <w:szCs w:val="20"/>
+        </w:rPr>
+        <w:t>ejs</w:t>
+      </w:r>
+      <w:proofErr w:type="spellEnd"/>
+      <w:r>
+        <w:rPr>
+          <w:rFonts w:eastAsia="Times New Roman" w:cs="Times New Roman"/>
+          <w:szCs w:val="24"/>
+        </w:rPr>
+        <w:br/>
+        <w:t xml:space="preserve">• </w:t>
+      </w:r>
+      <w:r>
+        <w:rPr>
+          <w:rFonts w:ascii="Consolas" w:eastAsia="Times New Roman" w:hAnsi="Consolas" w:cs="Courier New"/>
+          <w:szCs w:val="20"/>
+        </w:rPr>
+        <w:t>sqlite3</w:t>
+      </w:r>
+      <w:r>
+        <w:rPr>
+          <w:rFonts w:eastAsia="Times New Roman" w:cs="Times New Roman"/>
+          <w:szCs w:val="24"/>
+        </w:rPr>
+        <w:br/>
+        <w:t xml:space="preserve">• </w:t>
+      </w:r>
+      <w:r>
+        <w:rPr>
+          <w:rFonts w:ascii="Consolas" w:eastAsia="Times New Roman" w:hAnsi="Consolas" w:cs="Courier New"/>
+          <w:szCs w:val="20"/>
+        </w:rPr>
+        <w:t>express-session</w:t>
+      </w:r>
+      <w:r>
+        <w:rPr>
+          <w:rFonts w:eastAsia="Times New Roman" w:cs="Times New Roman"/>
+          <w:szCs w:val="24"/>
+        </w:rPr>
+        <w:br/>
+        <w:t xml:space="preserve">• </w:t>
+      </w:r>
+      <w:r>
+        <w:rPr>
+          <w:rFonts w:ascii="Consolas" w:eastAsia="Times New Roman" w:hAnsi="Consolas" w:cs="Courier New"/>
+          <w:szCs w:val="20"/>
+        </w:rPr>
+        <w:t>connect-sqlite3</w:t>
+      </w:r>
+      <w:r>
+        <w:rPr>
+          <w:rFonts w:eastAsia="Times New Roman" w:cs="Times New Roman"/>
+          <w:szCs w:val="24"/>
+        </w:rPr>
+        <w:br/>
+        <w:t xml:space="preserve">• </w:t>
+      </w:r>
+      <w:r>
+        <w:rPr>
+          <w:rFonts w:ascii="Consolas" w:eastAsia="Times New Roman" w:hAnsi="Consolas" w:cs="Courier New"/>
+          <w:szCs w:val="20"/>
+        </w:rPr>
+        <w:t>socket.io</w:t>
+      </w:r>
+      <w:r>
+        <w:rPr>
+          <w:rFonts w:eastAsia="Times New Roman" w:cs="Times New Roman"/>
+          <w:szCs w:val="24"/>
+        </w:rPr>
+        <w:br/>
+        <w:t xml:space="preserve">• </w:t>
+      </w:r>
+      <w:proofErr w:type="spellStart"/>
+      <w:r>
+        <w:rPr>
+          <w:rFonts w:ascii="Consolas" w:eastAsia="Times New Roman" w:hAnsi="Consolas" w:cs="Courier New"/>
+          <w:szCs w:val="20"/>
+        </w:rPr>
+        <w:t>multer</w:t>
+      </w:r>
+      <w:proofErr w:type="spellEnd"/>
+      <w:r>
+        <w:rPr>
+          <w:rFonts w:eastAsia="Times New Roman" w:cs="Times New Roman"/>
+          <w:szCs w:val="24"/>
+        </w:rPr>
+        <w:br/>
+        <w:t xml:space="preserve">• </w:t>
+      </w:r>
+      <w:proofErr w:type="spellStart"/>
+      <w:r>
+        <w:rPr>
+          <w:rFonts w:ascii="Consolas" w:eastAsia="Times New Roman" w:hAnsi="Consolas" w:cs="Courier New"/>
+          <w:szCs w:val="20"/>
+        </w:rPr>
+        <w:t>dotenv</w:t>
+      </w:r>
+      <w:proofErr w:type="spellEnd"/>
+      <w:r>
+        <w:rPr>
+          <w:rFonts w:eastAsia="Times New Roman" w:cs="Times New Roman"/>
+          <w:szCs w:val="24"/>
+        </w:rPr>
+        <w:br/>
+        <w:t xml:space="preserve">• A logger library such as </w:t>
+      </w:r>
+      <w:proofErr w:type="spellStart"/>
+      <w:r>
+        <w:rPr>
+          <w:rFonts w:ascii="Consolas" w:eastAsia="Times New Roman" w:hAnsi="Consolas" w:cs="Courier New"/>
+          <w:szCs w:val="20"/>
+        </w:rPr>
+        <w:t>winston</w:t>
+      </w:r>
+      <w:proofErr w:type="spellEnd"/>
+      <w:r>
+        <w:rPr>
+          <w:rFonts w:eastAsia="Times New Roman" w:cs="Times New Roman"/>
+          <w:szCs w:val="24"/>
+        </w:rPr>
+        <w:t xml:space="preserve"> or </w:t>
+      </w:r>
+      <w:proofErr w:type="spellStart"/>
+      <w:r>
+        <w:rPr>
+          <w:rFonts w:ascii="Consolas" w:eastAsia="Times New Roman" w:hAnsi="Consolas" w:cs="Courier New"/>
+          <w:szCs w:val="20"/>
+        </w:rPr>
+        <w:t>pino</w:t>
+      </w:r>
+      <w:proofErr w:type="spellEnd"/>
+      <w:r>
+        <w:rPr>
+          <w:rFonts w:eastAsia="Times New Roman" w:cs="Times New Roman"/>
+          <w:szCs w:val="24"/>
+        </w:rPr>
+        <w:t xml:space="preserve"> (or you may build your own simple logger).</w:t>
+      </w:r>
+      <w:r>
+        <w:rPr>
+          <w:rFonts w:eastAsia="Times New Roman" w:cs="Times New Roman"/>
+          <w:szCs w:val="24"/>
+        </w:rPr>
+        <w:br/>
+        <w:t xml:space="preserve">• </w:t>
+      </w:r>
+      <w:proofErr w:type="spellStart"/>
+      <w:r>
+        <w:rPr>
+          <w:rFonts w:ascii="Consolas" w:eastAsia="Times New Roman" w:hAnsi="Consolas" w:cs="Courier New"/>
+          <w:szCs w:val="20"/>
+        </w:rPr>
+        <w:t>nodemon</w:t>
+      </w:r>
+      <w:proofErr w:type="spellEnd"/>
+      <w:r>
+        <w:rPr>
+          <w:rFonts w:eastAsia="Times New Roman" w:cs="Times New Roman"/>
+          <w:szCs w:val="24"/>
+        </w:rPr>
+        <w:t xml:space="preserve"> (as a </w:t>
+      </w:r>
+      <w:proofErr w:type="spellStart"/>
+      <w:r>
+        <w:rPr>
+          <w:rFonts w:eastAsia="Times New Roman" w:cs="Times New Roman"/>
+          <w:szCs w:val="24"/>
+        </w:rPr>
+        <w:t>devDependency</w:t>
+      </w:r>
+      <w:proofErr w:type="spellEnd"/>
+      <w:r>
+        <w:rPr>
+          <w:rFonts w:eastAsia="Times New Roman" w:cs="Times New Roman"/>
+          <w:szCs w:val="24"/>
+        </w:rPr>
+        <w:t>).</w:t>
+      </w:r>
+    </w:p>
+    <w:p>
+      <w:pPr>
+        <w:spacing w:before="100" w:beforeAutospacing="1" w:after="100" w:afterAutospacing="1" w:line="240" w:lineRule="auto"/>
+        <w:rPr>
+          <w:rFonts w:eastAsia="Times New Roman" w:cs="Times New Roman"/>
+          <w:szCs w:val="24"/>
+        </w:rPr>
+      </w:pPr>
+      <w:r>
+        <w:rPr>
+          <w:rFonts w:eastAsia="Times New Roman" w:cs="Times New Roman"/>
+          <w:szCs w:val="24"/>
+        </w:rPr>
+        <w:t xml:space="preserve">• </w:t>
+      </w:r>
       <w:proofErr w:type="gramStart"/>
       <w:r>
         <w:rPr>
-          <w:rFonts w:ascii="Consolas" w:eastAsia="Times New Roman" w:hAnsi="Consolas" w:cs="Courier New"/>
-          <w:szCs w:val="20"/>
-        </w:rPr>
-        <w:t>package.json</w:t>
+          <w:rFonts w:eastAsia="Times New Roman" w:cs="Times New Roman"/>
+          <w:szCs w:val="24"/>
+        </w:rPr>
+        <w:t xml:space="preserve">Create </w:t>
+      </w:r>
+      <w:r>
+        <w:rPr>
+          <w:rFonts w:ascii="Consolas" w:eastAsia="Times New Roman" w:hAnsi="Consolas" w:cs="Courier New"/>
+          <w:szCs w:val="20"/>
+        </w:rPr>
+        <w:t>.</w:t>
+      </w:r>
+      <w:proofErr w:type="spellStart"/>
+      <w:r>
+        <w:rPr>
+          <w:rFonts w:ascii="Consolas" w:eastAsia="Times New Roman" w:hAnsi="Consolas" w:cs="Courier New"/>
+          <w:szCs w:val="20"/>
+        </w:rPr>
+        <w:t>gitignore</w:t>
       </w:r>
       <w:proofErr w:type="spellEnd"/>
       <w:proofErr w:type="gramEnd"/>
@@ -3131,7 +3489,53 @@
           <w:rFonts w:eastAsia="Times New Roman" w:cs="Times New Roman"/>
           <w:szCs w:val="24"/>
         </w:rPr>
-        <w:t xml:space="preserve"> using </w:t>
+        <w:t xml:space="preserve"> and verify that large or sensitive files are not tracked.</w:t>
+      </w:r>
+      <w:r>
+        <w:rPr>
+          <w:rFonts w:eastAsia="Times New Roman" w:cs="Times New Roman"/>
+          <w:szCs w:val="24"/>
+        </w:rPr>
+        <w:br/>
+        <w:t xml:space="preserve">• </w:t>
+      </w:r>
+      <w:proofErr w:type="gramStart"/>
+      <w:r>
+        <w:rPr>
+          <w:rFonts w:eastAsia="Times New Roman" w:cs="Times New Roman"/>
+          <w:szCs w:val="24"/>
+        </w:rPr>
+        <w:t xml:space="preserve">Create </w:t>
+      </w:r>
+      <w:r>
+        <w:rPr>
+          <w:rFonts w:ascii="Consolas" w:eastAsia="Times New Roman" w:hAnsi="Consolas" w:cs="Courier New"/>
+          <w:szCs w:val="20"/>
+        </w:rPr>
+        <w:t>.env</w:t>
+      </w:r>
+      <w:proofErr w:type="gramEnd"/>
+      <w:r>
+        <w:rPr>
+          <w:rFonts w:eastAsia="Times New Roman" w:cs="Times New Roman"/>
+          <w:szCs w:val="24"/>
+        </w:rPr>
+        <w:t xml:space="preserve"> </w:t>
+      </w:r>
+      <w:proofErr w:type="gramStart"/>
+      <w:r>
+        <w:rPr>
+          <w:rFonts w:eastAsia="Times New Roman" w:cs="Times New Roman"/>
+          <w:szCs w:val="24"/>
+        </w:rPr>
+        <w:t xml:space="preserve">and </w:t>
+      </w:r>
+      <w:r>
+        <w:rPr>
+          <w:rFonts w:ascii="Consolas" w:eastAsia="Times New Roman" w:hAnsi="Consolas" w:cs="Courier New"/>
+          <w:szCs w:val="20"/>
+        </w:rPr>
+        <w:t>.</w:t>
       </w:r>
       <w:proofErr w:type="spellStart"/>
       <w:r>
@@ -3139,15 +3543,47 @@
           <w:rFonts w:ascii="Consolas" w:eastAsia="Times New Roman" w:hAnsi="Consolas" w:cs="Courier New"/>
           <w:szCs w:val="20"/>
         </w:rPr>
-        <w:t>npm</w:t>
+        <w:t>env</w:t>
+      </w:r>
+      <w:proofErr w:type="gramEnd"/>
+      <w:r>
+        <w:rPr>
+          <w:rFonts w:ascii="Consolas" w:eastAsia="Times New Roman" w:hAnsi="Consolas" w:cs="Courier New"/>
+          <w:szCs w:val="20"/>
+        </w:rPr>
+        <w:t>_template</w:t>
       </w:r>
       <w:proofErr w:type="spellEnd"/>
       <w:r>
         <w:rPr>
-          <w:rFonts w:ascii="Consolas" w:eastAsia="Times New Roman" w:hAnsi="Consolas" w:cs="Courier New"/>
-          <w:szCs w:val="20"/>
-        </w:rPr>
-        <w:t xml:space="preserve"> </w:t>
+          <w:rFonts w:eastAsia="Times New Roman" w:cs="Times New Roman"/>
+          <w:szCs w:val="24"/>
+        </w:rPr>
+        <w:t xml:space="preserve"> with matching keys.</w:t>
+      </w:r>
+    </w:p>
+    <w:p>
+      <w:pPr>
+        <w:spacing w:before="100" w:beforeAutospacing="1" w:after="100" w:afterAutospacing="1" w:line="240" w:lineRule="auto"/>
+        <w:rPr>
+          <w:rFonts w:eastAsia="Times New Roman" w:cs="Times New Roman"/>
+          <w:szCs w:val="24"/>
+        </w:rPr>
+      </w:pPr>
+      <w:proofErr w:type="gramStart"/>
+      <w:r>
+        <w:rPr>
+          <w:rFonts w:eastAsia="Times New Roman" w:cs="Times New Roman"/>
+          <w:szCs w:val="24"/>
+        </w:rPr>
+        <w:t xml:space="preserve">Your </w:t>
+      </w:r>
+      <w:r>
+        <w:rPr>
+          <w:rFonts w:ascii="Consolas" w:eastAsia="Times New Roman" w:hAnsi="Consolas" w:cs="Courier New"/>
+          <w:szCs w:val="20"/>
+        </w:rPr>
+        <w:t>.</w:t>
       </w:r>
       <w:proofErr w:type="spellStart"/>
       <w:r>
@@ -3155,7 +3591,15 @@
           <w:rFonts w:ascii="Consolas" w:eastAsia="Times New Roman" w:hAnsi="Consolas" w:cs="Courier New"/>
           <w:szCs w:val="20"/>
         </w:rPr>
-        <w:t>init</w:t>
+        <w:t>env</w:t>
+      </w:r>
+      <w:proofErr w:type="gramEnd"/>
+      <w:r>
+        <w:rPr>
+          <w:rFonts w:ascii="Consolas" w:eastAsia="Times New Roman" w:hAnsi="Consolas" w:cs="Courier New"/>
+          <w:szCs w:val="20"/>
+        </w:rPr>
+        <w:t>_template</w:t>
       </w:r>
       <w:proofErr w:type="spellEnd"/>
       <w:r>
@@ -3163,7 +3607,105 @@
           <w:rFonts w:eastAsia="Times New Roman" w:cs="Times New Roman"/>
           <w:szCs w:val="24"/>
         </w:rPr>
-        <w:t xml:space="preserve"> or </w:t>
+        <w:t xml:space="preserve"> should include entries such as:</w:t>
+      </w:r>
+    </w:p>
+    <w:p>
+      <w:pPr>
+        <w:spacing w:before="100" w:beforeAutospacing="1" w:after="100" w:afterAutospacing="1" w:line="240" w:lineRule="auto"/>
+        <w:rPr>
+          <w:rFonts w:eastAsia="Times New Roman" w:cs="Times New Roman"/>
+          <w:szCs w:val="24"/>
+        </w:rPr>
+      </w:pPr>
+      <w:r>
+        <w:rPr>
+          <w:rFonts w:eastAsia="Times New Roman" w:cs="Times New Roman"/>
+          <w:szCs w:val="24"/>
+        </w:rPr>
+        <w:t xml:space="preserve">• </w:t>
+      </w:r>
+      <w:r>
+        <w:rPr>
+          <w:rFonts w:ascii="Consolas" w:eastAsia="Times New Roman" w:hAnsi="Consolas" w:cs="Courier New"/>
+          <w:szCs w:val="20"/>
+        </w:rPr>
+        <w:t>PORT=</w:t>
+      </w:r>
+      <w:r>
+        <w:rPr>
+          <w:rFonts w:eastAsia="Times New Roman" w:cs="Times New Roman"/>
+          <w:szCs w:val="24"/>
+        </w:rPr>
+        <w:br/>
+        <w:t xml:space="preserve">• </w:t>
+      </w:r>
+      <w:r>
+        <w:rPr>
+          <w:rFonts w:ascii="Consolas" w:eastAsia="Times New Roman" w:hAnsi="Consolas" w:cs="Courier New"/>
+          <w:szCs w:val="20"/>
+        </w:rPr>
+        <w:t>SESSION_SECRET=</w:t>
+      </w:r>
+      <w:r>
+        <w:rPr>
+          <w:rFonts w:eastAsia="Times New Roman" w:cs="Times New Roman"/>
+          <w:szCs w:val="24"/>
+        </w:rPr>
+        <w:br/>
+        <w:t xml:space="preserve">• </w:t>
+      </w:r>
+      <w:r>
+        <w:rPr>
+          <w:rFonts w:ascii="Consolas" w:eastAsia="Times New Roman" w:hAnsi="Consolas" w:cs="Courier New"/>
+          <w:szCs w:val="20"/>
+        </w:rPr>
+        <w:t>FORMBAR_CLIENT_ID=</w:t>
+      </w:r>
+      <w:r>
+        <w:rPr>
+          <w:rFonts w:eastAsia="Times New Roman" w:cs="Times New Roman"/>
+          <w:szCs w:val="24"/>
+        </w:rPr>
+        <w:br/>
+        <w:t xml:space="preserve">• </w:t>
+      </w:r>
+      <w:r>
+        <w:rPr>
+          <w:rFonts w:ascii="Consolas" w:eastAsia="Times New Roman" w:hAnsi="Consolas" w:cs="Courier New"/>
+          <w:szCs w:val="20"/>
+        </w:rPr>
+        <w:t>FORMBAR_CLIENT_SECRET=</w:t>
+      </w:r>
+      <w:r>
+        <w:rPr>
+          <w:rFonts w:eastAsia="Times New Roman" w:cs="Times New Roman"/>
+          <w:szCs w:val="24"/>
+        </w:rPr>
+        <w:br/>
+        <w:t xml:space="preserve">• </w:t>
+      </w:r>
+      <w:r>
+        <w:rPr>
+          <w:rFonts w:ascii="Consolas" w:eastAsia="Times New Roman" w:hAnsi="Consolas" w:cs="Courier New"/>
+          <w:szCs w:val="20"/>
+        </w:rPr>
+        <w:t>FORMBAR_REDIRECT_URI=</w:t>
+      </w:r>
+      <w:r>
+        <w:rPr>
+          <w:rFonts w:eastAsia="Times New Roman" w:cs="Times New Roman"/>
+          <w:szCs w:val="24"/>
+        </w:rPr>
+        <w:br/>
+        <w:t xml:space="preserve">• </w:t>
+      </w:r>
+      <w:r>
+        <w:rPr>
+          <w:rFonts w:ascii="Consolas" w:eastAsia="Times New Roman" w:hAnsi="Consolas" w:cs="Courier New"/>
+          <w:szCs w:val="20"/>
+        </w:rPr>
+        <w:t>DATABASE_FILE=./data/</w:t>
       </w:r>
       <w:proofErr w:type="spellStart"/>
       <w:r>
@@ -3171,531 +3713,39 @@
           <w:rFonts w:ascii="Consolas" w:eastAsia="Times New Roman" w:hAnsi="Consolas" w:cs="Courier New"/>
           <w:szCs w:val="20"/>
         </w:rPr>
-        <w:t>npm</w:t>
+        <w:t>database.sqlite</w:t>
       </w:r>
       <w:proofErr w:type="spellEnd"/>
-      <w:r>
-        <w:rPr>
-          <w:rFonts w:ascii="Consolas" w:eastAsia="Times New Roman" w:hAnsi="Consolas" w:cs="Courier New"/>
-          <w:szCs w:val="20"/>
-        </w:rPr>
-        <w:t xml:space="preserve"> </w:t>
-      </w:r>
-      <w:proofErr w:type="spellStart"/>
-      <w:r>
-        <w:rPr>
-          <w:rFonts w:ascii="Consolas" w:eastAsia="Times New Roman" w:hAnsi="Consolas" w:cs="Courier New"/>
-          <w:szCs w:val="20"/>
-        </w:rPr>
-        <w:t>init</w:t>
-      </w:r>
-      <w:proofErr w:type="spellEnd"/>
-      <w:r>
-        <w:rPr>
-          <w:rFonts w:ascii="Consolas" w:eastAsia="Times New Roman" w:hAnsi="Consolas" w:cs="Courier New"/>
-          <w:szCs w:val="20"/>
-        </w:rPr>
-        <w:t xml:space="preserve"> -y</w:t>
-      </w:r>
-      <w:r>
-        <w:rPr>
-          <w:rFonts w:eastAsia="Times New Roman" w:cs="Times New Roman"/>
-          <w:szCs w:val="24"/>
-        </w:rPr>
-        <w:t>.</w:t>
-      </w:r>
-      <w:r>
-        <w:rPr>
-          <w:rFonts w:eastAsia="Times New Roman" w:cs="Times New Roman"/>
-          <w:szCs w:val="24"/>
-        </w:rPr>
-        <w:br/>
-        <w:t>• Install core dependencies, at minimum:</w:t>
-      </w:r>
-      <w:r>
-        <w:rPr>
-          <w:rFonts w:eastAsia="Times New Roman" w:cs="Times New Roman"/>
-          <w:szCs w:val="24"/>
-        </w:rPr>
-        <w:br/>
-        <w:t xml:space="preserve">• </w:t>
-      </w:r>
-      <w:r>
-        <w:rPr>
-          <w:rFonts w:ascii="Consolas" w:eastAsia="Times New Roman" w:hAnsi="Consolas" w:cs="Courier New"/>
-          <w:szCs w:val="20"/>
-        </w:rPr>
-        <w:t>express</w:t>
-      </w:r>
-      <w:r>
-        <w:rPr>
-          <w:rFonts w:eastAsia="Times New Roman" w:cs="Times New Roman"/>
-          <w:szCs w:val="24"/>
-        </w:rPr>
-        <w:br/>
-        <w:t xml:space="preserve">• </w:t>
-      </w:r>
-      <w:proofErr w:type="spellStart"/>
-      <w:r>
-        <w:rPr>
-          <w:rFonts w:ascii="Consolas" w:eastAsia="Times New Roman" w:hAnsi="Consolas" w:cs="Courier New"/>
-          <w:szCs w:val="20"/>
-        </w:rPr>
-        <w:t>ejs</w:t>
-      </w:r>
-      <w:proofErr w:type="spellEnd"/>
-      <w:r>
-        <w:rPr>
-          <w:rFonts w:eastAsia="Times New Roman" w:cs="Times New Roman"/>
-          <w:szCs w:val="24"/>
-        </w:rPr>
-        <w:br/>
-        <w:t xml:space="preserve">• </w:t>
-      </w:r>
-      <w:r>
-        <w:rPr>
-          <w:rFonts w:ascii="Consolas" w:eastAsia="Times New Roman" w:hAnsi="Consolas" w:cs="Courier New"/>
-          <w:szCs w:val="20"/>
-        </w:rPr>
-        <w:t>sqlite3</w:t>
-      </w:r>
-      <w:r>
-        <w:rPr>
-          <w:rFonts w:eastAsia="Times New Roman" w:cs="Times New Roman"/>
-          <w:szCs w:val="24"/>
-        </w:rPr>
-        <w:br/>
-        <w:t xml:space="preserve">• </w:t>
-      </w:r>
-      <w:r>
-        <w:rPr>
-          <w:rFonts w:ascii="Consolas" w:eastAsia="Times New Roman" w:hAnsi="Consolas" w:cs="Courier New"/>
-          <w:szCs w:val="20"/>
-        </w:rPr>
-        <w:t>express-session</w:t>
-      </w:r>
-      <w:r>
-        <w:rPr>
-          <w:rFonts w:eastAsia="Times New Roman" w:cs="Times New Roman"/>
-          <w:szCs w:val="24"/>
-        </w:rPr>
-        <w:br/>
-        <w:t xml:space="preserve">• </w:t>
-      </w:r>
-      <w:r>
-        <w:rPr>
-          <w:rFonts w:ascii="Consolas" w:eastAsia="Times New Roman" w:hAnsi="Consolas" w:cs="Courier New"/>
-          <w:szCs w:val="20"/>
-        </w:rPr>
-        <w:t>connect-sqlite3</w:t>
-      </w:r>
-      <w:r>
-        <w:rPr>
-          <w:rFonts w:eastAsia="Times New Roman" w:cs="Times New Roman"/>
-          <w:szCs w:val="24"/>
-        </w:rPr>
-        <w:br/>
-        <w:t xml:space="preserve">• </w:t>
-      </w:r>
-      <w:r>
-        <w:rPr>
-          <w:rFonts w:ascii="Consolas" w:eastAsia="Times New Roman" w:hAnsi="Consolas" w:cs="Courier New"/>
-          <w:szCs w:val="20"/>
-        </w:rPr>
-        <w:t>socket.io</w:t>
-      </w:r>
-      <w:r>
-        <w:rPr>
-          <w:rFonts w:eastAsia="Times New Roman" w:cs="Times New Roman"/>
-          <w:szCs w:val="24"/>
-        </w:rPr>
-        <w:br/>
-        <w:t xml:space="preserve">• </w:t>
-      </w:r>
-      <w:proofErr w:type="spellStart"/>
-      <w:r>
-        <w:rPr>
-          <w:rFonts w:ascii="Consolas" w:eastAsia="Times New Roman" w:hAnsi="Consolas" w:cs="Courier New"/>
-          <w:szCs w:val="20"/>
-        </w:rPr>
-        <w:t>multer</w:t>
-      </w:r>
-      <w:proofErr w:type="spellEnd"/>
-      <w:r>
-        <w:rPr>
-          <w:rFonts w:eastAsia="Times New Roman" w:cs="Times New Roman"/>
-          <w:szCs w:val="24"/>
-        </w:rPr>
-        <w:br/>
-        <w:t xml:space="preserve">• </w:t>
-      </w:r>
-      <w:proofErr w:type="spellStart"/>
-      <w:r>
-        <w:rPr>
-          <w:rFonts w:ascii="Consolas" w:eastAsia="Times New Roman" w:hAnsi="Consolas" w:cs="Courier New"/>
-          <w:szCs w:val="20"/>
-        </w:rPr>
-        <w:t>dotenv</w:t>
-      </w:r>
-      <w:proofErr w:type="spellEnd"/>
-      <w:r>
-        <w:rPr>
-          <w:rFonts w:eastAsia="Times New Roman" w:cs="Times New Roman"/>
-          <w:szCs w:val="24"/>
-        </w:rPr>
-        <w:br/>
-        <w:t xml:space="preserve">• A logger library such as </w:t>
-      </w:r>
-      <w:proofErr w:type="spellStart"/>
-      <w:r>
-        <w:rPr>
-          <w:rFonts w:ascii="Consolas" w:eastAsia="Times New Roman" w:hAnsi="Consolas" w:cs="Courier New"/>
-          <w:szCs w:val="20"/>
-        </w:rPr>
-        <w:t>winston</w:t>
-      </w:r>
-      <w:proofErr w:type="spellEnd"/>
-      <w:r>
-        <w:rPr>
-          <w:rFonts w:eastAsia="Times New Roman" w:cs="Times New Roman"/>
-          <w:szCs w:val="24"/>
-        </w:rPr>
-        <w:t xml:space="preserve"> or </w:t>
-      </w:r>
-      <w:proofErr w:type="spellStart"/>
-      <w:r>
-        <w:rPr>
-          <w:rFonts w:ascii="Consolas" w:eastAsia="Times New Roman" w:hAnsi="Consolas" w:cs="Courier New"/>
-          <w:szCs w:val="20"/>
-        </w:rPr>
-        <w:t>pino</w:t>
-      </w:r>
-      <w:proofErr w:type="spellEnd"/>
-      <w:r>
-        <w:rPr>
-          <w:rFonts w:eastAsia="Times New Roman" w:cs="Times New Roman"/>
-          <w:szCs w:val="24"/>
-        </w:rPr>
-        <w:t xml:space="preserve"> (or you may build your own simple logger).</w:t>
-      </w:r>
-      <w:r>
-        <w:rPr>
-          <w:rFonts w:eastAsia="Times New Roman" w:cs="Times New Roman"/>
-          <w:szCs w:val="24"/>
-        </w:rPr>
-        <w:br/>
-        <w:t xml:space="preserve">• </w:t>
-      </w:r>
-      <w:proofErr w:type="spellStart"/>
-      <w:r>
-        <w:rPr>
-          <w:rFonts w:ascii="Consolas" w:eastAsia="Times New Roman" w:hAnsi="Consolas" w:cs="Courier New"/>
-          <w:szCs w:val="20"/>
-        </w:rPr>
-        <w:t>nodemon</w:t>
-      </w:r>
-      <w:proofErr w:type="spellEnd"/>
-      <w:r>
-        <w:rPr>
-          <w:rFonts w:eastAsia="Times New Roman" w:cs="Times New Roman"/>
-          <w:szCs w:val="24"/>
-        </w:rPr>
-        <w:t xml:space="preserve"> (as a </w:t>
-      </w:r>
-      <w:proofErr w:type="spellStart"/>
-      <w:r>
-        <w:rPr>
-          <w:rFonts w:eastAsia="Times New Roman" w:cs="Times New Roman"/>
-          <w:szCs w:val="24"/>
-        </w:rPr>
-        <w:t>devDependency</w:t>
-      </w:r>
-      <w:proofErr w:type="spellEnd"/>
-      <w:r>
-        <w:rPr>
-          <w:rFonts w:eastAsia="Times New Roman" w:cs="Times New Roman"/>
-          <w:szCs w:val="24"/>
-        </w:rPr>
-        <w:t>).</w:t>
-      </w:r>
-    </w:p>
-    <w:p>
-      <w:pPr>
-        <w:spacing w:before="100" w:beforeAutospacing="1" w:after="100" w:afterAutospacing="1" w:line="240" w:lineRule="auto"/>
-        <w:rPr>
-          <w:rFonts w:eastAsia="Times New Roman" w:cs="Times New Roman"/>
-          <w:szCs w:val="24"/>
-        </w:rPr>
-      </w:pPr>
-      <w:r>
-        <w:rPr>
-          <w:rFonts w:eastAsia="Times New Roman" w:cs="Times New Roman"/>
-          <w:szCs w:val="24"/>
-        </w:rPr>
-        <w:t xml:space="preserve">• </w:t>
-      </w:r>
+    </w:p>
+    <w:p>
+      <w:pPr>
+        <w:spacing w:before="100" w:beforeAutospacing="1" w:after="100" w:afterAutospacing="1" w:line="240" w:lineRule="auto"/>
+        <w:rPr>
+          <w:rFonts w:eastAsia="Times New Roman" w:cs="Times New Roman"/>
+          <w:szCs w:val="24"/>
+        </w:rPr>
+      </w:pPr>
       <w:proofErr w:type="gramStart"/>
       <w:r>
         <w:rPr>
           <w:rFonts w:eastAsia="Times New Roman" w:cs="Times New Roman"/>
           <w:szCs w:val="24"/>
         </w:rPr>
-        <w:t xml:space="preserve">Create </w:t>
-      </w:r>
-      <w:r>
-        <w:rPr>
-          <w:rFonts w:ascii="Consolas" w:eastAsia="Times New Roman" w:hAnsi="Consolas" w:cs="Courier New"/>
-          <w:szCs w:val="20"/>
-        </w:rPr>
-        <w:t>.</w:t>
-      </w:r>
-      <w:proofErr w:type="spellStart"/>
-      <w:r>
-        <w:rPr>
-          <w:rFonts w:ascii="Consolas" w:eastAsia="Times New Roman" w:hAnsi="Consolas" w:cs="Courier New"/>
-          <w:szCs w:val="20"/>
-        </w:rPr>
-        <w:t>gitignore</w:t>
-      </w:r>
-      <w:proofErr w:type="spellEnd"/>
+        <w:t xml:space="preserve">Your </w:t>
+      </w:r>
+      <w:r>
+        <w:rPr>
+          <w:rFonts w:ascii="Consolas" w:eastAsia="Times New Roman" w:hAnsi="Consolas" w:cs="Courier New"/>
+          <w:szCs w:val="20"/>
+        </w:rPr>
+        <w:t>.env</w:t>
+      </w:r>
       <w:proofErr w:type="gramEnd"/>
       <w:r>
         <w:rPr>
           <w:rFonts w:eastAsia="Times New Roman" w:cs="Times New Roman"/>
           <w:szCs w:val="24"/>
         </w:rPr>
-        <w:t xml:space="preserve"> and verify that large or sensitive files are not tracked.</w:t>
-      </w:r>
-      <w:r>
-        <w:rPr>
-          <w:rFonts w:eastAsia="Times New Roman" w:cs="Times New Roman"/>
-          <w:szCs w:val="24"/>
-        </w:rPr>
-        <w:br/>
-        <w:t xml:space="preserve">• Create </w:t>
-      </w:r>
-      <w:r>
-        <w:rPr>
-          <w:rFonts w:ascii="Consolas" w:eastAsia="Times New Roman" w:hAnsi="Consolas" w:cs="Courier New"/>
-          <w:szCs w:val="20"/>
-        </w:rPr>
-        <w:t>.env</w:t>
-      </w:r>
-      <w:r>
-        <w:rPr>
-          <w:rFonts w:eastAsia="Times New Roman" w:cs="Times New Roman"/>
-          <w:szCs w:val="24"/>
-        </w:rPr>
-        <w:t xml:space="preserve"> and </w:t>
-      </w:r>
-      <w:r>
-        <w:rPr>
-          <w:rFonts w:ascii="Consolas" w:eastAsia="Times New Roman" w:hAnsi="Consolas" w:cs="Courier New"/>
-          <w:szCs w:val="20"/>
-        </w:rPr>
-        <w:t>.</w:t>
-      </w:r>
-      <w:proofErr w:type="spellStart"/>
-      <w:r>
-        <w:rPr>
-          <w:rFonts w:ascii="Consolas" w:eastAsia="Times New Roman" w:hAnsi="Consolas" w:cs="Courier New"/>
-          <w:szCs w:val="20"/>
-        </w:rPr>
-        <w:t>env_template</w:t>
-      </w:r>
-      <w:proofErr w:type="spellEnd"/>
-      <w:r>
-        <w:rPr>
-          <w:rFonts w:eastAsia="Times New Roman" w:cs="Times New Roman"/>
-          <w:szCs w:val="24"/>
-        </w:rPr>
-        <w:t xml:space="preserve"> with matching keys.</w:t>
-      </w:r>
-    </w:p>
-    <w:p>
-      <w:pPr>
-        <w:spacing w:before="100" w:beforeAutospacing="1" w:after="100" w:afterAutospacing="1" w:line="240" w:lineRule="auto"/>
-        <w:rPr>
-          <w:rFonts w:eastAsia="Times New Roman" w:cs="Times New Roman"/>
-          <w:szCs w:val="24"/>
-        </w:rPr>
-      </w:pPr>
-      <w:proofErr w:type="gramStart"/>
-      <w:r>
-        <w:rPr>
-          <w:rFonts w:eastAsia="Times New Roman" w:cs="Times New Roman"/>
-          <w:szCs w:val="24"/>
-        </w:rPr>
-        <w:t xml:space="preserve">Your </w:t>
-      </w:r>
-      <w:r>
-        <w:rPr>
-          <w:rFonts w:ascii="Consolas" w:eastAsia="Times New Roman" w:hAnsi="Consolas" w:cs="Courier New"/>
-          <w:szCs w:val="20"/>
-        </w:rPr>
-        <w:t>.</w:t>
-      </w:r>
-      <w:proofErr w:type="spellStart"/>
-      <w:r>
-        <w:rPr>
-          <w:rFonts w:ascii="Consolas" w:eastAsia="Times New Roman" w:hAnsi="Consolas" w:cs="Courier New"/>
-          <w:szCs w:val="20"/>
-        </w:rPr>
-        <w:t>env</w:t>
-      </w:r>
-      <w:proofErr w:type="gramEnd"/>
-      <w:r>
-        <w:rPr>
-          <w:rFonts w:ascii="Consolas" w:eastAsia="Times New Roman" w:hAnsi="Consolas" w:cs="Courier New"/>
-          <w:szCs w:val="20"/>
-        </w:rPr>
-        <w:t>_template</w:t>
-      </w:r>
-      <w:proofErr w:type="spellEnd"/>
-      <w:r>
-        <w:rPr>
-          <w:rFonts w:eastAsia="Times New Roman" w:cs="Times New Roman"/>
-          <w:szCs w:val="24"/>
-        </w:rPr>
-        <w:t xml:space="preserve"> should include entries such as:</w:t>
-      </w:r>
-    </w:p>
-    <w:p>
-      <w:pPr>
-        <w:spacing w:before="100" w:beforeAutospacing="1" w:after="100" w:afterAutospacing="1" w:line="240" w:lineRule="auto"/>
-        <w:rPr>
-          <w:rFonts w:eastAsia="Times New Roman" w:cs="Times New Roman"/>
-          <w:szCs w:val="24"/>
-        </w:rPr>
-      </w:pPr>
-      <w:r>
-        <w:rPr>
-          <w:rFonts w:eastAsia="Times New Roman" w:cs="Times New Roman"/>
-          <w:szCs w:val="24"/>
-        </w:rPr>
-        <w:t xml:space="preserve">• </w:t>
-      </w:r>
-      <w:r>
-        <w:rPr>
-          <w:rFonts w:ascii="Consolas" w:eastAsia="Times New Roman" w:hAnsi="Consolas" w:cs="Courier New"/>
-          <w:szCs w:val="20"/>
-        </w:rPr>
-        <w:t>PORT=</w:t>
-      </w:r>
-      <w:r>
-        <w:rPr>
-          <w:rFonts w:eastAsia="Times New Roman" w:cs="Times New Roman"/>
-          <w:szCs w:val="24"/>
-        </w:rPr>
-        <w:br/>
-        <w:t xml:space="preserve">• </w:t>
-      </w:r>
-      <w:r>
-        <w:rPr>
-          <w:rFonts w:ascii="Consolas" w:eastAsia="Times New Roman" w:hAnsi="Consolas" w:cs="Courier New"/>
-          <w:szCs w:val="20"/>
-        </w:rPr>
-        <w:t>SESSION_SECRET=</w:t>
-      </w:r>
-      <w:r>
-        <w:rPr>
-          <w:rFonts w:eastAsia="Times New Roman" w:cs="Times New Roman"/>
-          <w:szCs w:val="24"/>
-        </w:rPr>
-        <w:br/>
-        <w:t xml:space="preserve">• </w:t>
-      </w:r>
-      <w:r>
-        <w:rPr>
-          <w:rFonts w:ascii="Consolas" w:eastAsia="Times New Roman" w:hAnsi="Consolas" w:cs="Courier New"/>
-          <w:szCs w:val="20"/>
-        </w:rPr>
-        <w:t>FORMBAR_CLIENT_ID=</w:t>
-      </w:r>
-      <w:r>
-        <w:rPr>
-          <w:rFonts w:eastAsia="Times New Roman" w:cs="Times New Roman"/>
-          <w:szCs w:val="24"/>
-        </w:rPr>
-        <w:br/>
-        <w:t xml:space="preserve">• </w:t>
-      </w:r>
-      <w:r>
-        <w:rPr>
-          <w:rFonts w:ascii="Consolas" w:eastAsia="Times New Roman" w:hAnsi="Consolas" w:cs="Courier New"/>
-          <w:szCs w:val="20"/>
-        </w:rPr>
-        <w:t>FORMBAR_CLIENT_SECRET=</w:t>
-      </w:r>
-      <w:r>
-        <w:rPr>
-          <w:rFonts w:eastAsia="Times New Roman" w:cs="Times New Roman"/>
-          <w:szCs w:val="24"/>
-        </w:rPr>
-        <w:br/>
-        <w:t xml:space="preserve">• </w:t>
-      </w:r>
-      <w:r>
-        <w:rPr>
-          <w:rFonts w:ascii="Consolas" w:eastAsia="Times New Roman" w:hAnsi="Consolas" w:cs="Courier New"/>
-          <w:szCs w:val="20"/>
-        </w:rPr>
-        <w:t>FORMBAR_REDIRECT_URI=</w:t>
-      </w:r>
-      <w:r>
-        <w:rPr>
-          <w:rFonts w:eastAsia="Times New Roman" w:cs="Times New Roman"/>
-          <w:szCs w:val="24"/>
-        </w:rPr>
-        <w:br/>
-        <w:t xml:space="preserve">• </w:t>
-      </w:r>
-      <w:r>
-        <w:rPr>
-          <w:rFonts w:ascii="Consolas" w:eastAsia="Times New Roman" w:hAnsi="Consolas" w:cs="Courier New"/>
-          <w:szCs w:val="20"/>
-        </w:rPr>
-        <w:t>DATABASE_FILE=./data/</w:t>
-      </w:r>
-      <w:proofErr w:type="spellStart"/>
-      <w:r>
-        <w:rPr>
-          <w:rFonts w:ascii="Consolas" w:eastAsia="Times New Roman" w:hAnsi="Consolas" w:cs="Courier New"/>
-          <w:szCs w:val="20"/>
-        </w:rPr>
-        <w:t>database.sqlite</w:t>
-      </w:r>
-      <w:proofErr w:type="spellEnd"/>
-    </w:p>
-    <w:p>
-      <w:pPr>
-        <w:spacing w:before="100" w:beforeAutospacing="1" w:after="100" w:afterAutospacing="1" w:line="240" w:lineRule="auto"/>
-        <w:rPr>
-          <w:rFonts w:eastAsia="Times New Roman" w:cs="Times New Roman"/>
-          <w:szCs w:val="24"/>
-        </w:rPr>
-      </w:pPr>
-      <w:proofErr w:type="gramStart"/>
-      <w:r>
-        <w:rPr>
-          <w:rFonts w:eastAsia="Times New Roman" w:cs="Times New Roman"/>
-          <w:szCs w:val="24"/>
-        </w:rPr>
-        <w:t xml:space="preserve">Your </w:t>
-      </w:r>
-      <w:r>
-        <w:rPr>
-          <w:rFonts w:ascii="Consolas" w:eastAsia="Times New Roman" w:hAnsi="Consolas" w:cs="Courier New"/>
-          <w:szCs w:val="20"/>
-        </w:rPr>
-        <w:t>.env</w:t>
-      </w:r>
-      <w:proofErr w:type="gramEnd"/>
-      <w:r>
-        <w:rPr>
-          <w:rFonts w:eastAsia="Times New Roman" w:cs="Times New Roman"/>
-          <w:szCs w:val="24"/>
-        </w:rPr>
         <w:t xml:space="preserve"> should have the same keys but filled with real values (not committed to Git).</w:t>
       </w:r>
     </w:p>
@@ -3712,8 +3762,8 @@
           <w:rFonts w:eastAsia="Times New Roman" w:cs="Times New Roman"/>
           <w:szCs w:val="24"/>
         </w:rPr>
-        <w:pict>
-          <v:rect id="_x0000_i1027" style="width:0;height:1.5pt" o:hralign="center" o:hrstd="t" o:hr="t" fillcolor="#a0a0a0" stroked="f"/>
+        <w:pict w14:anchorId="6BC138BE">
+          <v:rect id="_x0000_i1026" style="width:0;height:1.5pt" o:hralign="center" o:hrstd="t" o:hr="t" fillcolor="#a0a0a0" stroked="f"/>
         </w:pict>
       </w:r>
     </w:p>
@@ -4374,8 +4424,8 @@
           <w:rFonts w:eastAsia="Times New Roman" w:cs="Times New Roman"/>
           <w:szCs w:val="24"/>
         </w:rPr>
-        <w:pict>
-          <v:rect id="_x0000_i1028" style="width:0;height:1.5pt" o:hralign="center" o:hrstd="t" o:hr="t" fillcolor="#a0a0a0" stroked="f"/>
+        <w:pict w14:anchorId="6EAAB44D">
+          <v:rect id="_x0000_i1027" style="width:0;height:1.5pt" o:hralign="center" o:hrstd="t" o:hr="t" fillcolor="#a0a0a0" stroked="f"/>
         </w:pict>
       </w:r>
     </w:p>
@@ -4644,7 +4694,15 @@
           <w:rFonts w:ascii="Consolas" w:eastAsia="Times New Roman" w:hAnsi="Consolas" w:cs="Courier New"/>
           <w:szCs w:val="20"/>
         </w:rPr>
-        <w:t xml:space="preserve">"User logged in", { </w:t>
+        <w:t xml:space="preserve">"User logged in", </w:t>
+      </w:r>
+      <w:proofErr w:type="gramStart"/>
+      <w:r>
+        <w:rPr>
+          <w:rFonts w:ascii="Consolas" w:eastAsia="Times New Roman" w:hAnsi="Consolas" w:cs="Courier New"/>
+          <w:szCs w:val="20"/>
+        </w:rPr>
+        <w:t xml:space="preserve">{ </w:t>
       </w:r>
       <w:proofErr w:type="spellStart"/>
       <w:r>
@@ -4655,6 +4713,7 @@
         <w:t>userId</w:t>
       </w:r>
       <w:proofErr w:type="spellEnd"/>
+      <w:proofErr w:type="gramEnd"/>
       <w:r>
         <w:rPr>
           <w:rFonts w:ascii="Consolas" w:eastAsia="Times New Roman" w:hAnsi="Consolas" w:cs="Courier New"/>
@@ -4671,6 +4730,7 @@
         <w:t xml:space="preserve">• </w:t>
       </w:r>
       <w:proofErr w:type="spellStart"/>
+      <w:proofErr w:type="gramStart"/>
       <w:r>
         <w:rPr>
           <w:rFonts w:ascii="Consolas" w:eastAsia="Times New Roman" w:hAnsi="Consolas" w:cs="Courier New"/>
@@ -4679,6 +4739,7 @@
         <w:t>logger.error</w:t>
       </w:r>
       <w:proofErr w:type="spellEnd"/>
+      <w:proofErr w:type="gramEnd"/>
       <w:r>
         <w:rPr>
           <w:rFonts w:ascii="Consolas" w:eastAsia="Times New Roman" w:hAnsi="Consolas" w:cs="Courier New"/>
@@ -4749,8 +4810,8 @@
           <w:rFonts w:eastAsia="Times New Roman" w:cs="Times New Roman"/>
           <w:szCs w:val="24"/>
         </w:rPr>
-        <w:pict>
-          <v:rect id="_x0000_i1029" style="width:0;height:1.5pt" o:hralign="center" o:hrstd="t" o:hr="t" fillcolor="#a0a0a0" stroked="f"/>
+        <w:pict w14:anchorId="25D3E1BD">
+          <v:rect id="_x0000_i1028" style="width:0;height:1.5pt" o:hralign="center" o:hrstd="t" o:hr="t" fillcolor="#a0a0a0" stroked="f"/>
         </w:pict>
       </w:r>
     </w:p>
@@ -5178,7 +5239,6 @@
         <w:t xml:space="preserve">, </w:t>
       </w:r>
       <w:proofErr w:type="spellStart"/>
-      <w:proofErr w:type="gramStart"/>
       <w:r>
         <w:rPr>
           <w:rFonts w:ascii="Consolas" w:eastAsia="Times New Roman" w:hAnsi="Consolas" w:cs="Courier New"/>
@@ -5187,7 +5247,6 @@
         <w:t>cookie.maxAge</w:t>
       </w:r>
       <w:proofErr w:type="spellEnd"/>
-      <w:proofErr w:type="gramEnd"/>
       <w:r>
         <w:rPr>
           <w:rFonts w:eastAsia="Times New Roman" w:cs="Times New Roman"/>
@@ -5334,8 +5393,8 @@
           <w:rFonts w:eastAsia="Times New Roman" w:cs="Times New Roman"/>
           <w:szCs w:val="24"/>
         </w:rPr>
-        <w:pict>
-          <v:rect id="_x0000_i1030" style="width:0;height:1.5pt" o:hralign="center" o:hrstd="t" o:hr="t" fillcolor="#a0a0a0" stroked="f"/>
+        <w:pict w14:anchorId="4C87DB90">
+          <v:rect id="_x0000_i1029" style="width:0;height:1.5pt" o:hralign="center" o:hrstd="t" o:hr="t" fillcolor="#a0a0a0" stroked="f"/>
         </w:pict>
       </w:r>
     </w:p>
@@ -5910,8 +5969,8 @@
           <w:rFonts w:eastAsia="Times New Roman" w:cs="Times New Roman"/>
           <w:szCs w:val="24"/>
         </w:rPr>
-        <w:pict>
-          <v:rect id="_x0000_i1031" style="width:0;height:1.5pt" o:hralign="center" o:hrstd="t" o:hr="t" fillcolor="#a0a0a0" stroked="f"/>
+        <w:pict w14:anchorId="12FEFD3B">
+          <v:rect id="_x0000_i1030" style="width:0;height:1.5pt" o:hralign="center" o:hrstd="t" o:hr="t" fillcolor="#a0a0a0" stroked="f"/>
         </w:pict>
       </w:r>
     </w:p>
@@ -6559,8 +6618,8 @@
           <w:rFonts w:eastAsia="Times New Roman" w:cs="Times New Roman"/>
           <w:szCs w:val="24"/>
         </w:rPr>
-        <w:pict>
-          <v:rect id="_x0000_i1032" style="width:0;height:1.5pt" o:hralign="center" o:hrstd="t" o:hr="t" fillcolor="#a0a0a0" stroked="f"/>
+        <w:pict w14:anchorId="5B4572B6">
+          <v:rect id="_x0000_i1031" style="width:0;height:1.5pt" o:hralign="center" o:hrstd="t" o:hr="t" fillcolor="#a0a0a0" stroked="f"/>
         </w:pict>
       </w:r>
     </w:p>
@@ -6890,8 +6949,8 @@
           <w:rFonts w:eastAsia="Times New Roman" w:cs="Times New Roman"/>
           <w:szCs w:val="24"/>
         </w:rPr>
-        <w:pict>
-          <v:rect id="_x0000_i1033" style="width:0;height:1.5pt" o:hralign="center" o:hrstd="t" o:hr="t" fillcolor="#a0a0a0" stroked="f"/>
+        <w:pict w14:anchorId="124E8564">
+          <v:rect id="_x0000_i1032" style="width:0;height:1.5pt" o:hralign="center" o:hrstd="t" o:hr="t" fillcolor="#a0a0a0" stroked="f"/>
         </w:pict>
       </w:r>
     </w:p>
@@ -7220,7 +7279,23 @@
           <w:rFonts w:ascii="Consolas" w:eastAsia="Times New Roman" w:hAnsi="Consolas" w:cs="Courier New"/>
           <w:szCs w:val="20"/>
         </w:rPr>
-        <w:t>id": 1, "username": "smith" },</w:t>
+        <w:t>id": 1, "username": "smith</w:t>
+      </w:r>
+      <w:proofErr w:type="gramStart"/>
+      <w:r>
+        <w:rPr>
+          <w:rFonts w:ascii="Consolas" w:eastAsia="Times New Roman" w:hAnsi="Consolas" w:cs="Courier New"/>
+          <w:szCs w:val="20"/>
+        </w:rPr>
+        <w:t>" }</w:t>
+      </w:r>
+      <w:proofErr w:type="gramEnd"/>
+      <w:r>
+        <w:rPr>
+          <w:rFonts w:ascii="Consolas" w:eastAsia="Times New Roman" w:hAnsi="Consolas" w:cs="Courier New"/>
+          <w:szCs w:val="20"/>
+        </w:rPr>
+        <w:t>,</w:t>
       </w:r>
     </w:p>
     <w:p>
@@ -7270,8 +7345,17 @@
           <w:rFonts w:ascii="Consolas" w:eastAsia="Times New Roman" w:hAnsi="Consolas" w:cs="Courier New"/>
           <w:szCs w:val="20"/>
         </w:rPr>
-        <w:t>id": 2, "username": "student1" }</w:t>
-      </w:r>
+        <w:t>id": 2, "username": "student1</w:t>
+      </w:r>
+      <w:proofErr w:type="gramStart"/>
+      <w:r>
+        <w:rPr>
+          <w:rFonts w:ascii="Consolas" w:eastAsia="Times New Roman" w:hAnsi="Consolas" w:cs="Courier New"/>
+          <w:szCs w:val="20"/>
+        </w:rPr>
+        <w:t>" }</w:t>
+      </w:r>
+      <w:proofErr w:type="gramEnd"/>
     </w:p>
     <w:p>
       <w:pPr>
@@ -7394,8 +7478,8 @@
           <w:rFonts w:eastAsia="Times New Roman" w:cs="Times New Roman"/>
           <w:szCs w:val="24"/>
         </w:rPr>
-        <w:pict>
-          <v:rect id="_x0000_i1034" style="width:0;height:1.5pt" o:hralign="center" o:hrstd="t" o:hr="t" fillcolor="#a0a0a0" stroked="f"/>
+        <w:pict w14:anchorId="695FF590">
+          <v:rect id="_x0000_i1033" style="width:0;height:1.5pt" o:hralign="center" o:hrstd="t" o:hr="t" fillcolor="#a0a0a0" stroked="f"/>
         </w:pict>
       </w:r>
     </w:p>
@@ -7600,8 +7684,8 @@
           <w:rFonts w:eastAsia="Times New Roman" w:cs="Times New Roman"/>
           <w:szCs w:val="24"/>
         </w:rPr>
-        <w:pict>
-          <v:rect id="_x0000_i1035" style="width:0;height:1.5pt" o:hralign="center" o:hrstd="t" o:hr="t" fillcolor="#a0a0a0" stroked="f"/>
+        <w:pict w14:anchorId="215C83E9">
+          <v:rect id="_x0000_i1034" style="width:0;height:1.5pt" o:hralign="center" o:hrstd="t" o:hr="t" fillcolor="#a0a0a0" stroked="f"/>
         </w:pict>
       </w:r>
     </w:p>
@@ -7803,8 +7887,8 @@
           <w:rFonts w:eastAsia="Times New Roman" w:cs="Times New Roman"/>
           <w:szCs w:val="24"/>
         </w:rPr>
-        <w:pict>
-          <v:rect id="_x0000_i1036" style="width:0;height:1.5pt" o:hralign="center" o:hrstd="t" o:hr="t" fillcolor="#a0a0a0" stroked="f"/>
+        <w:pict w14:anchorId="753D3903">
+          <v:rect id="_x0000_i1035" style="width:0;height:1.5pt" o:hralign="center" o:hrstd="t" o:hr="t" fillcolor="#a0a0a0" stroked="f"/>
         </w:pict>
       </w:r>
     </w:p>
@@ -8122,7 +8206,6 @@
         </w:rPr>
         <w:t xml:space="preserve"> and </w:t>
       </w:r>
-      <w:proofErr w:type="spellStart"/>
       <w:r>
         <w:rPr>
           <w:rFonts w:ascii="Consolas" w:eastAsia="Times New Roman" w:hAnsi="Consolas" w:cs="Courier New"/>
@@ -8130,7 +8213,6 @@
         </w:rPr>
         <w:t>io</w:t>
       </w:r>
-      <w:proofErr w:type="spellEnd"/>
       <w:r>
         <w:rPr>
           <w:rFonts w:eastAsia="Times New Roman" w:cs="Times New Roman"/>
@@ -8174,8 +8256,8 @@
           <w:rFonts w:eastAsia="Times New Roman" w:cs="Times New Roman"/>
           <w:szCs w:val="24"/>
         </w:rPr>
-        <w:pict>
-          <v:rect id="_x0000_i1037" style="width:0;height:1.5pt" o:hralign="center" o:hrstd="t" o:hr="t" fillcolor="#a0a0a0" stroked="f"/>
+        <w:pict w14:anchorId="48C13135">
+          <v:rect id="_x0000_i1036" style="width:0;height:1.5pt" o:hralign="center" o:hrstd="t" o:hr="t" fillcolor="#a0a0a0" stroked="f"/>
         </w:pict>
       </w:r>
     </w:p>
@@ -8310,7 +8392,15 @@
           <w:rFonts w:eastAsia="Times New Roman" w:cs="Times New Roman"/>
           <w:szCs w:val="24"/>
         </w:rPr>
-        <w:t xml:space="preserve"> to </w:t>
+        <w:t xml:space="preserve"> </w:t>
+      </w:r>
+      <w:proofErr w:type="gramStart"/>
+      <w:r>
+        <w:rPr>
+          <w:rFonts w:eastAsia="Times New Roman" w:cs="Times New Roman"/>
+          <w:szCs w:val="24"/>
+        </w:rPr>
+        <w:t xml:space="preserve">to </w:t>
       </w:r>
       <w:r>
         <w:rPr>
@@ -8319,6 +8409,7 @@
         </w:rPr>
         <w:t>.env</w:t>
       </w:r>
+      <w:proofErr w:type="gramEnd"/>
       <w:r>
         <w:rPr>
           <w:rFonts w:eastAsia="Times New Roman" w:cs="Times New Roman"/>
@@ -8496,7 +8587,7 @@
 </file>
 
 <file path=word/styles.xml><?xml version="1.0" encoding="utf-8"?>
-<w:styles xmlns:mc="http://schemas.openxmlformats.org/markup-compatibility/2006" xmlns:r="http://schemas.openxmlformats.org/officeDocument/2006/relationships" xmlns:w="http://schemas.openxmlformats.org/wordprocessingml/2006/main" xmlns:w14="http://schemas.microsoft.com/office/word/2010/wordml" xmlns:w15="http://schemas.microsoft.com/office/word/2012/wordml" xmlns:w16cid="http://schemas.microsoft.com/office/word/2016/wordml/cid" xmlns:w16se="http://schemas.microsoft.com/office/word/2015/wordml/symex" mc:Ignorable="w14 w15 w16se w16cid">
+<w:styles xmlns:mc="http://schemas.openxmlformats.org/markup-compatibility/2006" xmlns:r="http://schemas.openxmlformats.org/officeDocument/2006/relationships" xmlns:w="http://schemas.openxmlformats.org/wordprocessingml/2006/main" xmlns:w14="http://schemas.microsoft.com/office/word/2010/wordml" xmlns:w15="http://schemas.microsoft.com/office/word/2012/wordml" xmlns:w16cex="http://schemas.microsoft.com/office/word/2018/wordml/cex" xmlns:w16cid="http://schemas.microsoft.com/office/word/2016/wordml/cid" xmlns:w16="http://schemas.microsoft.com/office/word/2018/wordml" xmlns:w16du="http://schemas.microsoft.com/office/word/2023/wordml/word16du" xmlns:w16sdtdh="http://schemas.microsoft.com/office/word/2020/wordml/sdtdatahash" xmlns:w16sdtfl="http://schemas.microsoft.com/office/word/2024/wordml/sdtformatlock" xmlns:w16se="http://schemas.microsoft.com/office/word/2015/wordml/symex" mc:Ignorable="w14 w15 w16se w16cid w16 w16cex w16sdtdh w16sdtfl w16du">
   <w:docDefaults>
     <w:rPrDefault>
       <w:rPr>
@@ -8512,7 +8603,7 @@
       </w:pPr>
     </w:pPrDefault>
   </w:docDefaults>
-  <w:latentStyles w:defLockedState="0" w:defUIPriority="99" w:defSemiHidden="0" w:defUnhideWhenUsed="0" w:defQFormat="0" w:count="375">
+  <w:latentStyles w:defLockedState="0" w:defUIPriority="99" w:defSemiHidden="0" w:defUnhideWhenUsed="0" w:defQFormat="0" w:count="376">
     <w:lsdException w:name="Normal" w:uiPriority="0" w:qFormat="1"/>
     <w:lsdException w:name="heading 1" w:uiPriority="9" w:qFormat="1"/>
     <w:lsdException w:name="heading 2" w:semiHidden="1" w:uiPriority="9" w:unhideWhenUsed="1" w:qFormat="1"/>
@@ -8888,6 +8979,7 @@
     <w:lsdException w:name="Smart Hyperlink" w:semiHidden="1" w:unhideWhenUsed="1"/>
     <w:lsdException w:name="Hashtag" w:semiHidden="1" w:unhideWhenUsed="1"/>
     <w:lsdException w:name="Unresolved Mention" w:semiHidden="1" w:unhideWhenUsed="1"/>
+    <w:lsdException w:name="Smart Link" w:semiHidden="1" w:unhideWhenUsed="1"/>
   </w:latentStyles>
   <w:style w:type="paragraph" w:default="1" w:styleId="Normal">
     <w:name w:val="Normal"/>

</xml_diff>